<commit_message>
Humanize Chazal paper per the skill
Remove AI writing tells: drop the 'on one hand/on the other' symmetry and the
mechanical first/second/third enumeration, cut most 'not X but Y' constructions,
trim summary-moral closers, and vary sentence rhythm. Content and citations
unchanged.

Co-Authored-By: Claude Opus 4.8 <noreply@anthropic.com>
Claude-Session: https://claude.ai/code/session_01VbbPAGC8dgxj7crtn1UqbW
</commit_message>
<xml_diff>
--- a/עבודת_סיום_חזל.docx
+++ b/עבודת_סיום_חזל.docx
@@ -205,7 +205,7 @@
           <w:szCs w:val="24"/>
           <w:rtl w:val="1"/>
         </w:rPr>
-        <w:t>בחרתי בפרשת עגלה ערופה ובקריאה שחז"ל קוראים בה, כי היא נותנת בדיוק את המסר שהייתי רוצה לחדד בפני קבוצה שאני מובילה: שמנהיג אחראי לא רק על מה שעשה, אלא גם על מי שנשמט מתשומת ליבו.</w:t>
+        <w:t>בחרתי בפרשת עגלה ערופה, ובקריאה שחז"ל קוראים בה, כי יש בה בדיוק המסר שהייתי רוצה לחדד בפני קבוצה שאני מובילה. מנהיג אחראי גם על מי שנשמט מתשומת ליבו, ולא רק על מה שעשה במו ידיו.</w:t>
       </w:r>
     </w:p>
     <w:p>
@@ -256,7 +256,7 @@
           <w:szCs w:val="24"/>
           <w:rtl w:val="1"/>
         </w:rPr>
-        <w:t>ג. מדוע הוא רלוונטי. כאן טמון הכוח של הטקסט למי שמוביל קבוצה. חז"ל הופכים הצהרת חפות להצהרת אחריות. הם קוראים לתוך הפסוק שאלה על מנהיגות: לא רק "האם הרמתי יד", אלא "האם שמתי לב שמישהו יוצא לדרך לבד, בלי מזון ובלי מלווה". התלמוד מרחיב את זה עד הקצה: "כל שאינו מלוה ומתלוה כאילו שופך דמים" (בבלי, סוטה מו ע"ב). את המסר הזה הייתי מביאה לקבוצה שאני מובילה. הקלות שבה אנחנו פוטרים את עצמנו, "אני לא עשיתי כלום", היא בדיוק מה שהמשנה באה לפרק. מנהיג טוב נמדד לא במה שעשה לאלה שנמצאים איתו בחדר, אלא במי שיצא מהחדר בלי שליווה אותו. פרשת עגלה ערופה, בקריאה של חז"ל, היא גם דוגמה יפה לתנועה שהקורס עסק בה, מהמקרא אל המשנה ואל התלמוד: ההלכה המקראית נשארת, אבל המשמעות המוסרית שנקראת לתוכה הולכת ומעמיקה.</w:t>
+        <w:t>ג. מדוע הוא רלוונטי. כאן טמון הכוח של הטקסט למי שמוביל קבוצה. חז"ל הופכים הצהרת חפות להצהרת אחריות. הם קוראים לתוך הפסוק שאלה על מנהיגות: לא רק "האם הרמתי יד", אלא "האם שמתי לב שמישהו יוצא לדרך לבד, בלי מזון ובלי מלווה". התלמוד מרחיב את זה עד הקצה: "כל שאינו מלוה ומתלוה כאילו שופך דמים" (בבלי, סוטה מו ע"ב). את המסר הזה הייתי מביאה לקבוצה שאני מובילה. הקלות שבה אנחנו פוטרים את עצמנו, "אני לא עשיתי כלום", היא בדיוק מה שהמשנה באה לפרק. המבחן האמיתי של מנהיג הוא דווקא מי שיצא מהחדר בלי שליווה אותו, לא מי שנשאר בפנים. ויש כאן גם דוגמה יפה לתנועה שהקורס עסק בה, מהמקרא אל המשנה ואל התלמוד. ההלכה המקראית נשארת במקומה, והמשמעות המוסרית שנקראת לתוכה רק הולכת ומעמיקה.</w:t>
       </w:r>
     </w:p>
     <w:p>
@@ -290,7 +290,7 @@
           <w:szCs w:val="24"/>
           <w:rtl w:val="1"/>
         </w:rPr>
-        <w:t>בעיניי החיבור המשמעותי ביותר של תקופת חז"ל הוא המשנה. לא משום שהיא הראשונה בזמן, אלא משום שהיא זו שקבעה את הצורה שבה היהדות תלמד ותתווכח מאז ועד היום.</w:t>
+        <w:t>בעיניי החיבור המשמעותי ביותר של תקופת חז"ל הוא המשנה. היא אמנם לא הראשונה בזמן, אבל היא זו שקבעה את הצורה שבה היהדות תלמד ותתווכח מאז ועד היום.</w:t>
       </w:r>
     </w:p>
     <w:p>
@@ -341,7 +341,7 @@
           <w:szCs w:val="24"/>
           <w:rtl w:val="1"/>
         </w:rPr>
-        <w:t>אפשר לראות את תפיסת העולם של המשנה כבר במבנה שלה. היא נפתחת בסדר זרעים בשאלה מאימתי קוראים את שמע, כלומר בקבלת עול מלכות שמים, ומסתיימת בטהרות בדברי שבח לשלום. המהלך מן ההכרזה על מלכות האל ועד השלום איננו מקרי, הוא מסמן שהמשנה איננה רק אוסף דינים אלא חזון שלם של חיים.</w:t>
+        <w:t>אפשר לראות את תפיסת העולם של המשנה כבר במבנה שלה. היא נפתחת בסדר זרעים בשאלה מאימתי קוראים את שמע, כלומר בקבלת עול מלכות שמים, ומסתיימת בטהרות בדברי שבח לשלום. המהלך מן ההכרזה על מלכות האל ועד השלום איננו מקרי. הוא מסמן שהמשנה איננה אוסף דינים בלבד, יש בה חזון שלם של חיים.</w:t>
       </w:r>
     </w:p>
     <w:p>
@@ -358,7 +358,7 @@
           <w:szCs w:val="24"/>
           <w:rtl w:val="1"/>
         </w:rPr>
-        <w:t>ג. דוגמה. מאפיין ייחודי של המשנה הוא שהיא משמרת גם את דעת היחיד שנדחתה. במסכת עדויות נאמר: "ולמה מזכירין דברי היחיד בין המרובין... שאם יראה בית דין את דברי היחיד ויסמוך עליו" (משנה, עדויות א, ה). כלומר המשנה שומרת בכוונה את הדעה שלא נפסקה כהלכה, כדי שבית דין עתידי יוכל להיזקק לה. זו דוגמה מדויקת לאופייה: מצד אחד סמכות ופסיקה, מצד שני ריבוי קולות ומחלוקת חיה בתוך הטקסט המחייב עצמו. דווקא הפתיחות הזאת היא שהפכה את המשנה לבסיס של דיון שנמשך אלפי שנים, ולמעשה ייסדה את הדרך שבה היהדות חושבת: לא בהכרעה שמוחקת את הצד שכנגד, אלא בשימור המחלוקת בתוך הקאנון עצמו.</w:t>
+        <w:t>ג. דוגמה. מאפיין ייחודי של המשנה הוא שהיא משמרת גם את דעת היחיד שנדחתה. במסכת עדויות נאמר: "ולמה מזכירין דברי היחיד בין המרובין... שאם יראה בית דין את דברי היחיד ויסמוך עליו" (משנה, עדויות א, ה). כלומר המשנה שומרת בכוונה את הדעה שלא נפסקה כהלכה, כדי שבית דין עתידי יוכל להיזקק לה. זו דוגמה מדויקת לאופייה. יש בה סמכות והכרעה, ובאותה נשימה ריבוי קולות ומחלוקת חיה בתוך הטקסט המחייב עצמו. הפתיחות הזאת היא שהפכה את המשנה לבסיס של דיון שנמשך אלפי שנים. היהדות למדה ממנה לשמר את המחלוקת בתוך הקאנון במקום למחוק את הצד שכנגד.</w:t>
       </w:r>
     </w:p>
     <w:p>
@@ -460,7 +460,7 @@
           <w:szCs w:val="24"/>
           <w:rtl w:val="1"/>
         </w:rPr>
-        <w:t>ד. משמעותו לימינו. לדעתי זהו המדרש הנלמד ביותר על החורבן משום שהוא סיפור המכונן של ההישרדות היהודית. הוא מספר איך דת שנשענה על מקדש וקורבנות הפכה לדת של לימוד וטקסט, ניידת, שיכולה לשרוד בכל מקום. "תן לי יבנה וחכמיה" הוא הרגע שבו נבחרת ההמשכיות הרוחנית על פני הריבונות והאבן. לכן הוא נשאר רלוונטי: הוא המודל של בנייה מחדש אחרי אסון, ושל הבחירה בחיים ובלימוד גם כשהמרכז נחרב. זו התנועה "ממקדש לאדם" בתמצית.</w:t>
+        <w:t>ד. משמעותו לימינו. לדעתי זהו המדרש הנלמד ביותר על החורבן משום שהוא סיפור המכונן של ההישרדות היהודית. הוא מספר איך דת שנשענה על מקדש וקורבנות הפכה לדת של לימוד וטקסט, ניידת, שיכולה לשרוד בכל מקום. "תן לי יבנה וחכמיה" הוא הרגע שבו נבחרת ההמשכיות הרוחנית על פני הריבונות והאבן. לכן הוא נשאר רלוונטי. הוא המודל של בנייה מחדש אחרי אסון, ושל הבחירה בחיים ובלימוד גם כשהמרכז נחרב.</w:t>
       </w:r>
     </w:p>
     <w:p>
@@ -528,7 +528,7 @@
           <w:szCs w:val="24"/>
           <w:rtl w:val="1"/>
         </w:rPr>
-        <w:t>ב. מגמות ומאפיינים של תקופת חז"ל. ראשית, המדרש מציב את לימוד התורה כערך העליון, שגובר על ייחוס ועל עושר. אליעזר אינו בן כוהנים ולא עילוי מנעוריו, הוא בן איכר שמתחיל מאוחר ובאדמת טרשים, ובכל זאת התורה פתוחה בפניו. זו אחת התנועות המרכזיות של התקופה, פתיחת התורה לכל אדם והפיכת בית המדרש למרכז שמחליף את סדרי הייחוס הישנים. שנית, המדרש מעמיד במרכז את יחסי הרב והתלמיד ואת הלימוד שבעל פה: ריב"ז מלמד את אליעזר יום יום, מהיסוד, והידע עובר מפה לאוזן ולא מספר. שלישית, יש כאן אידיאל של מסירות קיצונית לתורה, ותפיסה שהלימוד עצמו מקדש את האדם, עד שפניו מאירות כפני משה. זהו ביטוי מובהק למעבר "מנביא לחכם": מקום הנבואה נתפס עתה על ידי החכם שדורש בבית המדרש.</w:t>
+        <w:t>ב. מגמות ומאפיינים של תקופת חז"ל. המדרש מציב את לימוד התורה כערך עליון שגובר על ייחוס ועל עושר. אליעזר אינו בן כוהנים ולא עילוי מנעוריו, הוא בן איכר שמתחיל מאוחר ובאדמת טרשים, ובכל זאת התורה פתוחה בפניו. זו אחת התנועות המרכזיות של התקופה, פתיחת התורה לכל אדם והפיכת בית המדרש למרכז שמחליף את סדרי הייחוס הישנים. לצד זה בולט אופי הלימוד. ריב"ז מלמד את אליעזר יום יום, מהיסוד ופנים אל פנים, והידע עובר מפה לאוזן ולא מן הכתב, כדרכה של תורה שבעל פה. ויש כאן עוד רובד, התפיסה שהלימוד עצמו מקדש את האדם, עד שפניו מאירות כפני משה. זהו ביטוי מובהק למעבר "מנביא לחכם", שבו מקום הנבואה נתפס עכשיו בידי החכם שדורש בבית המדרש.</w:t>
       </w:r>
     </w:p>
     <w:p>
@@ -545,7 +545,7 @@
           <w:szCs w:val="24"/>
           <w:rtl w:val="1"/>
         </w:rPr>
-        <w:t>כדאי לשים לב גם לפרט הקטן שחותם את הסיפור. כשהורקנוס האב שומע ששבחו של ריב"ז נאמר על בנו, תגובתו אינה גאווה של אב אלא רצון להיות שותף בעצמו בזכות: "אשרי אני שיצא זה מחלציי". גם כאן מבצבצת מגמה של התקופה, שבה מעמדו של אדם נמדד לא בשדותיו אלא בקרבתו לתורה ולחכמים.</w:t>
+        <w:t>שווה לשים לב גם לפרט הקטן שחותם את הסיפור. כשהורקנוס האב שומע ששבחו של ריב"ז נאמר על בנו, תגובתו אינה גאווה של אב. היא רצון להיות שותף בעצמו בזכות: "אשרי אני שיצא זה מחלציי". גם כאן מבצבצת מגמה של התקופה, שבה מעמדו של אדם נמדד עכשיו בקרבתו לתורה ולחכמים, ולא בגודל שדותיו.</w:t>
       </w:r>
     </w:p>
     <w:p>
@@ -562,7 +562,7 @@
           <w:szCs w:val="24"/>
           <w:rtl w:val="1"/>
         </w:rPr>
-        <w:t>ג. הרחבה על דמות ר' אליעזר ממקורות נוספים. הדמות הזאת מורכבת יותר משנדמה במבט ראשון. אותו ר' אליעזר, שהגיע אל התורה מבחוץ ומאוחר וכנגד כל הציפיות, הוא גם זה שאומר במשנה על לימוד תורה לנשים: "כל המלמד את בתו תורה כאילו מלמדה תפלות" (משנה, סוטה ג, ד). ההקשר שם חריף במיוחד, שכן דבריו נאמרים כנגד עמדתו של בן עזאי, שקבע שחייב אדם ללמד את בתו תורה. מי שנאבק בעצמו על הכניסה אל עולם התורה מציב דווקא גבול חד בפני מי שמבקש להיכנס אליו מכיוון אחר. בויארין, במאמרו על נשים לומדות, מראה כיצד עמדות כאלה אינן גחמה אישית אלא קשורות בתפיסה רבנית רחבה של גוף, מגדר וגבולות הלימוד, שבה עולם בית המדרש נבנה כמרחב גברי. הצירוף בין שני המקורות מצייר את ר' אליעזר כדמות של אדם שהתורה הצילה והגדירה, ושבה בעצמו לשמור בקנאות על מי נכנס בשעריה. דווקא המורכבות הזאת הופכת אותו לדמות מייצגת של התקופה, שבה נקבעים גם השערים הפתוחים, לבן איכר שמתחיל מאפס, וגם הגבולות הנעולים, בפני מי שנשאר מבחוץ.</w:t>
+        <w:t>ג. הרחבה על דמות ר' אליעזר ממקורות נוספים. הדמות הזאת מורכבת יותר משנדמה במבט ראשון. אותו ר' אליעזר, שהגיע אל התורה מבחוץ ומאוחר וכנגד כל הציפיות, הוא גם זה שאומר במשנה על לימוד תורה לנשים: "כל המלמד את בתו תורה כאילו מלמדה תפלות" (משנה, סוטה ג, ד). ההקשר שם חריף במיוחד, שכן דבריו נאמרים כנגד עמדתו של בן עזאי, שקבע שחייב אדם ללמד את בתו תורה. מי שנאבק בעצמו על הכניסה אל עולם התורה מציב דווקא גבול חד בפני מי שמבקש להיכנס אליו מכיוון אחר. בויארין, במאמרו על נשים לומדות, מראה שעמדות כאלה אינן גחמה אישית. הן קשורות בתפיסה רבנית רחבה של גוף ומגדר, שבה עולם בית המדרש נבנה כמרחב גברי. הצירוף בין שני המקורות מצייר את ר' אליעזר כדמות של אדם שהתורה הצילה והגדירה, ושבה בעצמו לשמור בקנאות על מי נכנס בשעריה. דווקא המורכבות הזאת הופכת אותו לדמות מייצגת של התקופה, שבה נקבעים גם השערים הפתוחים, לבן איכר שמתחיל מאפס, וגם הגבולות הנעולים, בפני מי שנשאר מבחוץ.</w:t>
       </w:r>
     </w:p>
     <w:p>

</xml_diff>

<commit_message>
Ground article citations in the actual texts; fix misattribution
Read the readable course articles: correct 'From Temple to Humanity /
mimikdash la-adam' authorship from Furstenberg (the file label) to its actual
author Yair Lorberbaum (Daat 86, 2018), and ground Q3 in Lorberbaum's thesis
(holiness shifts from Temple to every person, via the image-of-God idea) and
Marx's reading (the coffin journey as symbolic rebirth into the People of the
Book). Ground Q4's Boyarin citation in the actual chapter (ben Azzai vs R.
Eliezer, Mishnah Sotah 3:4). Halbertal and Shinan are image-only scans and
remain thesis-level.

Co-Authored-By: Claude Opus 4.8 <noreply@anthropic.com>
Claude-Session: https://claude.ai/code/session_01VbbPAGC8dgxj7crtn1UqbW
</commit_message>
<xml_diff>
--- a/עבודת_סיום_חזל.docx
+++ b/עבודת_סיום_חזל.docx
@@ -443,7 +443,7 @@
           <w:szCs w:val="24"/>
           <w:rtl w:val="1"/>
         </w:rPr>
-        <w:t>ג. בעזרת המאמר. פורסטנברג, במאמרו "ממקדש לאדם", מציב את הסיפור הזה בלב תהליך רחב: אחרי החורבן עובר מוקד הקדושה מן המקדש אל האדם ואל בית המדרש. בקשתו של ריב"ז מגלמת בדיוק את המעבר הזה. הוא אינו מבקש להציל את המקדש אלא את יבנה וחכמיה, כלומר בוחר בהמשכיות התורה על פני המרכז הפיזי. מרקס, בדיונו על ריב"ז והקמת יבנה, מראה כיצד הבחירה הזאת הפכה למוסד ממשי, לבית ועד שממנו צומחת מחדש ההנהגה שאיבדה את מרכזה בירושלים. על רקע זה מובנת גם הביקורת המרומזת על ריב"ז. הדרשן רומז שאולי היה יכול לבקש יותר, ואף מפעיל על החכם את הפסוק "משיב חכמים אחור" (ישעיהו מד, כה), כלומר גם חכמתו של הגדול הוגבלה ברגע הגורלי. השתיקה והספק אינם פגם בסיפור אלא חלק ממנו: האגדה אינה מוסרת שבח פשוט אלא מתלבטת בשאלה מה מותר ואפשר להציל כשהכול קורס.</w:t>
+        <w:t>ג. בעזרת המאמר. לורברבוים, במאמרו "ממקדש לאדם: תמורות במוקד הקדושה בספרות חז"ל", מראה שאחרי החורבן מעתיקה ספרות חז"ל, ובעיקר השכבה התנאית, את מוקד הקדושה מן המקדש אל האדם. הוא מדגיש שההעתקה הזאת אינה אל אישיות קדושה ויוצאת דופן, אלא אל האדם, אל כל אדם, מכוח הרעיון שהאדם נברא בצלם אלוהים. בקשתו של ריב"ז מגלמת את ראשית התנועה הזאת. הוא אינו מבקש להציל את המקדש אלא את יבנה וחכמיה, ובכך בוחר בהמשכיות התורה ובבני האדם הלומדים אותה על פני המרכז הפיזי. מרקס, בניתוח סיפור ריב"ז והקמת יבנה, מוסיפה שהיציאה בארון היא הצגה סמלית של עצם השינוי: היהדות שהיתה דת של גוף, של ארץ ושל פולחן במקדש נולדת מחדש כ"עם הספר", ולדבריה האגדה אינה מתארת את המעבר בלבד אלא יוצרת אותו ומעניקה לו משמעות. על רקע זה מובנת גם הביקורת המרומזת על ריב"ז. הדרשן רומז שאולי היה יכול לבקש יותר, ואף מפעיל על החכם את הפסוק "משיב חכמים אחור" (ישעיהו מד, כה), כלומר גם חכמתו של הגדול הוגבלה ברגע הגורלי. השתיקה והספק אינם פגם בסיפור, הם חלק ממנו, והאגדה מתלבטת בשאלה מה מותר ואפשר להציל כשהכול קורס.</w:t>
       </w:r>
     </w:p>
     <w:p>
@@ -562,7 +562,7 @@
           <w:szCs w:val="24"/>
           <w:rtl w:val="1"/>
         </w:rPr>
-        <w:t>ג. הרחבה על דמות ר' אליעזר ממקורות נוספים. הדמות הזאת מורכבת יותר משנדמה במבט ראשון. אותו ר' אליעזר, שהגיע אל התורה מבחוץ ומאוחר וכנגד כל הציפיות, הוא גם זה שאומר במשנה על לימוד תורה לנשים: "כל המלמד את בתו תורה כאילו מלמדה תפלות" (משנה, סוטה ג, ד). ההקשר שם חריף במיוחד, שכן דבריו נאמרים כנגד עמדתו של בן עזאי, שקבע שחייב אדם ללמד את בתו תורה. מי שנאבק בעצמו על הכניסה אל עולם התורה מציב דווקא גבול חד בפני מי שמבקש להיכנס אליו מכיוון אחר. בויארין, במאמרו על נשים לומדות, מראה שעמדות כאלה אינן גחמה אישית. הן קשורות בתפיסה רבנית רחבה של גוף ומגדר, שבה עולם בית המדרש נבנה כמרחב גברי. הצירוף בין שני המקורות מצייר את ר' אליעזר כדמות של אדם שהתורה הצילה והגדירה, ושבה בעצמו לשמור בקנאות על מי נכנס בשעריה. דווקא המורכבות הזאת הופכת אותו לדמות מייצגת של התקופה, שבה נקבעים גם השערים הפתוחים, לבן איכר שמתחיל מאפס, וגם הגבולות הנעולים, בפני מי שנשאר מבחוץ.</w:t>
+        <w:t>ג. הרחבה על דמות ר' אליעזר ממקורות נוספים. הדמות הזאת מורכבת יותר משנדמה במבט ראשון. אותו ר' אליעזר, שהגיע אל התורה מבחוץ ומאוחר וכנגד כל הציפיות, הוא גם זה שאומר במשנה על לימוד תורה לנשים: "כל המלמד את בתו תורה כאילו מלמדה תפלות" (משנה, סוטה ג, ד). ההקשר שם חריף במיוחד, שכן דבריו נאמרים כנגד עמדתו של בן עזאי באותה משנה: "חייב אדם ללמד את בתו תורה". מי שנאבק בעצמו על הכניסה אל עולם התורה מציב דווקא גבול חד בפני מי שמבקש להיכנס אליו מכיוון אחר. בויארין, בפרק "נשים לומדות: התנגדות מתוך השיח הגברי", קורא את המחלוקת הזאת כמחלוקת עקרונית ולא כפרט שולי. הוא מראה שהבבלי והירושלמי מפרשים את המשנה בכיוונים שונים לגמרי, ושהעמדה השוללת לימוד תורה מנשים קשורה בבנייתו של בית המדרש כמרחב גברי, שבו תלמוד תורה הוא המעשה שזוכה להערכה הגבוהה ביותר. הצירוף בין שני המקורות מצייר את ר' אליעזר כדמות של אדם שהתורה הצילה והגדירה, ושבה בעצמו לשמור בקנאות על מי נכנס בשעריה. דווקא המורכבות הזאת הופכת אותו לדמות מייצגת של התקופה, שבה נקבעים גם השערים הפתוחים, לבן איכר שמתחיל מאפס, וגם הגבולות הנעולים, בפני מי שנשאר מבחוץ.</w:t>
       </w:r>
     </w:p>
     <w:p>
@@ -639,7 +639,7 @@
           <w:szCs w:val="24"/>
           <w:rtl w:val="1"/>
         </w:rPr>
-        <w:t xml:space="preserve">בויארין, ד'. </w:t>
+        <w:t xml:space="preserve">בויארין, ד'. נשים לומדות: התנגדות מתוך השיח הגברי. בתוך </w:t>
       </w:r>
       <w:r>
         <w:rPr>
@@ -649,7 +649,7 @@
           <w:szCs w:val="24"/>
           <w:rtl w:val="1"/>
         </w:rPr>
-        <w:t>נשים לומדות: הבשר שברוח</w:t>
+        <w:t>הבשר שברוח</w:t>
       </w:r>
       <w:r>
         <w:rPr>
@@ -677,7 +677,7 @@
           <w:szCs w:val="24"/>
           <w:rtl w:val="1"/>
         </w:rPr>
-        <w:t xml:space="preserve">הלברטל, מ'. </w:t>
+        <w:t>הלברטל, מ'. מבוא ל</w:t>
       </w:r>
       <w:r>
         <w:rPr>
@@ -687,7 +687,7 @@
           <w:szCs w:val="24"/>
           <w:rtl w:val="1"/>
         </w:rPr>
-        <w:t>מבוא למשנה</w:t>
+        <w:t>משנה</w:t>
       </w:r>
       <w:r>
         <w:rPr>
@@ -715,7 +715,7 @@
           <w:szCs w:val="24"/>
           <w:rtl w:val="1"/>
         </w:rPr>
-        <w:t xml:space="preserve">מרקס, ד'. </w:t>
+        <w:t xml:space="preserve">לורברבוים, י' (2018). ממקדש לאדם: תמורות במוקד הקדושה בספרות חז"ל. </w:t>
       </w:r>
       <w:r>
         <w:rPr>
@@ -725,7 +725,7 @@
           <w:szCs w:val="24"/>
           <w:rtl w:val="1"/>
         </w:rPr>
-        <w:t>רבן יוחנן בן זכאי והקמת יבנה</w:t>
+        <w:t>דעת: כתב עת לפילוסופיה יהודית וקבלה</w:t>
       </w:r>
       <w:r>
         <w:rPr>
@@ -735,7 +735,7 @@
           <w:szCs w:val="24"/>
           <w:rtl w:val="1"/>
         </w:rPr>
-        <w:t>. (מתוך חומרי הקורס).</w:t>
+        <w:t>, 86, 377-396.</w:t>
       </w:r>
     </w:p>
     <w:p>
@@ -753,7 +753,7 @@
           <w:szCs w:val="24"/>
           <w:rtl w:val="1"/>
         </w:rPr>
-        <w:t xml:space="preserve">פורסטנברג, י'. </w:t>
+        <w:t xml:space="preserve">מרקס, ד'. </w:t>
       </w:r>
       <w:r>
         <w:rPr>
@@ -763,7 +763,7 @@
           <w:szCs w:val="24"/>
           <w:rtl w:val="1"/>
         </w:rPr>
-        <w:t>ממקדש לאדם</w:t>
+        <w:t>רבן יוחנן בן זכאי והקמת יבנה: ניתוח והערכת הסיפור בראי הזמן</w:t>
       </w:r>
       <w:r>
         <w:rPr>

</xml_diff>

<commit_message>
Ground Halbertal citation (Q2) in the actual text
Read the scanned Halbertal introduction and ground Q2 in his actual claim: the
Mishnah is the product of a new ideal-type (the Torah scholar) born in a new
institution (the study house), and disagreement is legitimate precisely because
the sages do not speak in the name of revelation. All three articles used in
the paper (Halbertal, Marx, Lorberbaum, Boyarin) are now based on real reading.

Co-Authored-By: Claude Opus 4.8 <noreply@anthropic.com>
Claude-Session: https://claude.ai/code/session_01VbbPAGC8dgxj7crtn1UqbW
</commit_message>
<xml_diff>
--- a/עבודת_סיום_חזל.docx
+++ b/עבודת_סיום_חזל.docx
@@ -324,7 +324,7 @@
           <w:szCs w:val="24"/>
           <w:rtl w:val="1"/>
         </w:rPr>
-        <w:t>ב. משמעותה והשינוי שחוללה. הלברטל, במבוא למשנה, מראה שהמשנה איננה רק ספר חוקים אלא סוג חדש של טקסט, שמעמיד את החכמים כנושאי הסמכות של התורה. זו התנועה שהקורס כינה "מנביא לחכם": מרכז הכובד של הדת עובר מן הנבואה ומן המקדש אל בית המדרש ואל ציבור החכמים. המשנה מכוננת את התורה שבעל פה כמערכת אוטונומית, ובכך היא משנה את פני היהדות. השפעתה עצומה: שני התלמודים נבנו עליה כפירוש, וכל ההלכה שאחריה יונקת ממנה.</w:t>
+        <w:t>ב. משמעותה והשינוי שחוללה. הלברטל, במבוא למשנה, קובע שהמשנה היא "תוצר של עלייתו של אידיאל טיפוס חדש: התלמיד חכם, והולדתה במוסד חדש: בית המדרש". לדבריו, דווקא משום שהחכמים אינם מדברים בשם ההתגלות, כפי שדיברו הנביאים, המחלוקת ביניהם לגיטימית, וזו הסיבה שהמשנה יכולה לשמר דעות חלוקות זו לצד זו בתוך הטקסט המחייב. זו התנועה שהקורס כינה "מנביא לחכם": מרכז הכובד של הדת עובר מן הנבואה ומן המקדש אל בית המדרש ואל ציבור החכמים. המשנה מכוננת בכך את התורה שבעל פה כמערכת בפני עצמה, ומשנה את פני היהדות. השפעתה עצומה, שני התלמודים נבנו עליה כפירוש, וכל ההלכה שאחריה יונקת ממנה.</w:t>
       </w:r>
     </w:p>
     <w:p>
@@ -677,7 +677,7 @@
           <w:szCs w:val="24"/>
           <w:rtl w:val="1"/>
         </w:rPr>
-        <w:t>הלברטל, מ'. מבוא ל</w:t>
+        <w:t xml:space="preserve">הלברטל, מ'. מבוא. בתוך </w:t>
       </w:r>
       <w:r>
         <w:rPr>
@@ -687,7 +687,7 @@
           <w:szCs w:val="24"/>
           <w:rtl w:val="1"/>
         </w:rPr>
-        <w:t>משנה</w:t>
+        <w:t>ששה סדרי משנה</w:t>
       </w:r>
       <w:r>
         <w:rPr>

</xml_diff>

<commit_message>
Fix bibliography: proper citations from the syllabus, drop 'from course materials'
Replace the non-standard '(from course materials)' notes with full references
taken from the course syllabus: Boyarin's chapter is 'Ta'avat ha-limud' (Am
Oved, pp. 170-183); Halbertal's 'Mavo la-Mishnah' (Yedioth, Am ha-Sefer series);
Lorberbaum in Daat 86 (2018), 377-398 (syllabus confirms Lorberbaum, not the
file's 'Furstenberg' label). Marx left with an explicit placeholder since neither
the syllabus copy nor the article gives full publication details.

Co-Authored-By: Claude Opus 4.8 <noreply@anthropic.com>
Claude-Session: https://claude.ai/code/session_01VbbPAGC8dgxj7crtn1UqbW
</commit_message>
<xml_diff>
--- a/עבודת_סיום_חזל.docx
+++ b/עבודת_סיום_חזל.docx
@@ -562,7 +562,7 @@
           <w:szCs w:val="24"/>
           <w:rtl w:val="1"/>
         </w:rPr>
-        <w:t>ג. הרחבה על דמות ר' אליעזר ממקורות נוספים. הדמות הזאת מורכבת יותר משנדמה במבט ראשון. אותו ר' אליעזר, שהגיע אל התורה מבחוץ ומאוחר וכנגד כל הציפיות, הוא גם זה שאומר במשנה על לימוד תורה לנשים: "כל המלמד את בתו תורה כאילו מלמדה תפלות" (משנה, סוטה ג, ד). ההקשר שם חריף במיוחד, שכן דבריו נאמרים כנגד עמדתו של בן עזאי באותה משנה: "חייב אדם ללמד את בתו תורה". מי שנאבק בעצמו על הכניסה אל עולם התורה מציב דווקא גבול חד בפני מי שמבקש להיכנס אליו מכיוון אחר. בויארין, בפרק "נשים לומדות: התנגדות מתוך השיח הגברי", קורא את המחלוקת הזאת כמחלוקת עקרונית ולא כפרט שולי. הוא מראה שהבבלי והירושלמי מפרשים את המשנה בכיוונים שונים לגמרי, ושהעמדה השוללת לימוד תורה מנשים קשורה בבנייתו של בית המדרש כמרחב גברי, שבו תלמוד תורה הוא המעשה שזוכה להערכה הגבוהה ביותר. הצירוף בין שני המקורות מצייר את ר' אליעזר כדמות של אדם שהתורה הצילה והגדירה, ושבה בעצמו לשמור בקנאות על מי נכנס בשעריה. דווקא המורכבות הזאת הופכת אותו לדמות מייצגת של התקופה, שבה נקבעים גם השערים הפתוחים, לבן איכר שמתחיל מאפס, וגם הגבולות הנעולים, בפני מי שנשאר מבחוץ.</w:t>
+        <w:t>ג. הרחבה על דמות ר' אליעזר ממקורות נוספים. הדמות הזאת מורכבת יותר משנדמה במבט ראשון. אותו ר' אליעזר, שהגיע אל התורה מבחוץ ומאוחר וכנגד כל הציפיות, הוא גם זה שאומר במשנה על לימוד תורה לנשים: "כל המלמד את בתו תורה כאילו מלמדה תפלות" (משנה, סוטה ג, ד). ההקשר שם חריף במיוחד, שכן דבריו נאמרים כנגד עמדתו של בן עזאי באותה משנה: "חייב אדם ללמד את בתו תורה". מי שנאבק בעצמו על הכניסה אל עולם התורה מציב דווקא גבול חד בפני מי שמבקש להיכנס אליו מכיוון אחר. בויארין, בפרק "תאוות הלימוד: התורה כאישה אחרת", קורא את המחלוקת הזאת כמחלוקת עקרונית ולא כפרט שולי. הוא מראה שהבבלי והירושלמי מפרשים את המשנה בכיוונים שונים לגמרי, ושהעמדה השוללת לימוד תורה מנשים קשורה בבנייתו של בית המדרש כמרחב גברי, שבו תלמוד תורה הוא המעשה שזוכה להערכה הגבוהה ביותר. הצירוף בין שני המקורות מצייר את ר' אליעזר כדמות של אדם שהתורה הצילה והגדירה, ושבה בעצמו לשמור בקנאות על מי נכנס בשעריה. דווקא המורכבות הזאת הופכת אותו לדמות מייצגת של התקופה, שבה נקבעים גם השערים הפתוחים, לבן איכר שמתחיל מאפס, וגם הגבולות הנעולים, בפני מי שנשאר מבחוץ.</w:t>
       </w:r>
     </w:p>
     <w:p>
@@ -602,7 +602,7 @@
           <w:szCs w:val="24"/>
           <w:rtl w:val="1"/>
         </w:rPr>
-        <w:t xml:space="preserve">אבות דרבי נתן, נוסח א. </w:t>
+        <w:t xml:space="preserve">בויארין, ד' (תשנ"ט). תאוות הלימוד: התורה כאישה אחרת. בתוך </w:t>
       </w:r>
       <w:r>
         <w:rPr>
@@ -612,6 +612,7 @@
           <w:szCs w:val="24"/>
           <w:rtl w:val="1"/>
         </w:rPr>
+        <w:t>הבשר שברוח: שיח המיניות בתלמוד</w:t>
       </w:r>
       <w:r>
         <w:rPr>
@@ -621,7 +622,7 @@
           <w:szCs w:val="24"/>
           <w:rtl w:val="1"/>
         </w:rPr>
-        <w:t>(דף מקורות הקורס: איך נעשים חכם.ה).</w:t>
+        <w:t xml:space="preserve"> (עמ' 170-183). תל אביב: עם עובד.</w:t>
       </w:r>
     </w:p>
     <w:p>
@@ -639,7 +640,7 @@
           <w:szCs w:val="24"/>
           <w:rtl w:val="1"/>
         </w:rPr>
-        <w:t xml:space="preserve">בויארין, ד'. נשים לומדות: התנגדות מתוך השיח הגברי. בתוך </w:t>
+        <w:t xml:space="preserve">הלברטל, מ'. מבוא למשנה. בתוך </w:t>
       </w:r>
       <w:r>
         <w:rPr>
@@ -649,7 +650,7 @@
           <w:szCs w:val="24"/>
           <w:rtl w:val="1"/>
         </w:rPr>
-        <w:t>הבשר שברוח</w:t>
+        <w:t>שישה סדרי משנה</w:t>
       </w:r>
       <w:r>
         <w:rPr>
@@ -659,45 +660,7 @@
           <w:szCs w:val="24"/>
           <w:rtl w:val="1"/>
         </w:rPr>
-        <w:t>. (מתוך חומרי הקורס).</w:t>
-      </w:r>
-    </w:p>
-    <w:p>
-      <w:pPr>
-        <w:bidi w:val="1"/>
-        <w:spacing w:line="360" w:lineRule="auto" w:after="120"/>
-        <w:ind w:left="432" w:hanging="432"/>
-        <w:jc w:val="right"/>
-      </w:pPr>
-      <w:r>
-        <w:rPr>
-          <w:rFonts w:ascii="David" w:hAnsi="David" w:cs="David"/>
-          <w:b w:val="0"/>
-          <w:sz w:val="24"/>
-          <w:szCs w:val="24"/>
-          <w:rtl w:val="1"/>
-        </w:rPr>
-        <w:t xml:space="preserve">הלברטל, מ'. מבוא. בתוך </w:t>
-      </w:r>
-      <w:r>
-        <w:rPr>
-          <w:rFonts w:ascii="David" w:hAnsi="David" w:cs="David"/>
-          <w:i/>
-          <w:sz w:val="24"/>
-          <w:szCs w:val="24"/>
-          <w:rtl w:val="1"/>
-        </w:rPr>
-        <w:t>ששה סדרי משנה</w:t>
-      </w:r>
-      <w:r>
-        <w:rPr>
-          <w:rFonts w:ascii="David" w:hAnsi="David" w:cs="David"/>
-          <w:b w:val="0"/>
-          <w:sz w:val="24"/>
-          <w:szCs w:val="24"/>
-          <w:rtl w:val="1"/>
-        </w:rPr>
-        <w:t>. (מתוך חומרי הקורס).</w:t>
+        <w:t xml:space="preserve"> (סדרת עם הספר). תל אביב: ידיעות אחרונות.</w:t>
       </w:r>
     </w:p>
     <w:p>
@@ -735,7 +698,7 @@
           <w:szCs w:val="24"/>
           <w:rtl w:val="1"/>
         </w:rPr>
-        <w:t>, 86, 377-396.</w:t>
+        <w:t>, 86, 377-398.</w:t>
       </w:r>
     </w:p>
     <w:p>
@@ -753,7 +716,7 @@
           <w:szCs w:val="24"/>
           <w:rtl w:val="1"/>
         </w:rPr>
-        <w:t xml:space="preserve">מרקס, ד'. </w:t>
+        <w:t xml:space="preserve">מרקס, ד'. רבן יוחנן בן זכאי והקמת יבנה: ניתוח והערכת הסיפור בראי הזמן. </w:t>
       </w:r>
       <w:r>
         <w:rPr>
@@ -763,7 +726,6 @@
           <w:szCs w:val="24"/>
           <w:rtl w:val="1"/>
         </w:rPr>
-        <w:t>רבן יוחנן בן זכאי והקמת יבנה: ניתוח והערכת הסיפור בראי הזמן</w:t>
       </w:r>
       <w:r>
         <w:rPr>
@@ -773,7 +735,44 @@
           <w:szCs w:val="24"/>
           <w:rtl w:val="1"/>
         </w:rPr>
-        <w:t>. (מתוך חומרי הקורס).</w:t>
+        <w:t>[פרטי הפרסום להשלמה מהסילבוס].</w:t>
+      </w:r>
+    </w:p>
+    <w:p>
+      <w:pPr>
+        <w:bidi w:val="1"/>
+        <w:spacing w:line="360" w:lineRule="auto" w:after="120"/>
+        <w:ind w:left="432" w:hanging="432"/>
+        <w:jc w:val="right"/>
+      </w:pPr>
+      <w:r>
+        <w:rPr>
+          <w:rFonts w:ascii="David" w:hAnsi="David" w:cs="David"/>
+          <w:b w:val="0"/>
+          <w:sz w:val="24"/>
+          <w:szCs w:val="24"/>
+          <w:rtl w:val="1"/>
+        </w:rPr>
+      </w:r>
+      <w:r>
+        <w:rPr>
+          <w:rFonts w:ascii="David" w:hAnsi="David" w:cs="David"/>
+          <w:i/>
+          <w:sz w:val="24"/>
+          <w:szCs w:val="24"/>
+          <w:rtl w:val="1"/>
+        </w:rPr>
+        <w:t>אבות דרבי נתן</w:t>
+      </w:r>
+      <w:r>
+        <w:rPr>
+          <w:rFonts w:ascii="David" w:hAnsi="David" w:cs="David"/>
+          <w:b w:val="0"/>
+          <w:sz w:val="24"/>
+          <w:szCs w:val="24"/>
+          <w:rtl w:val="1"/>
+        </w:rPr>
+        <w:t>, נוסח א.</w:t>
       </w:r>
     </w:p>
     <w:p>
@@ -810,7 +809,7 @@
           <w:szCs w:val="24"/>
           <w:rtl w:val="1"/>
         </w:rPr>
-        <w:t>, מסכתות סוטה, עדויות (על פי דפי המקורות של הקורס).</w:t>
+        <w:t>, מסכתות סוטה ועדויות.</w:t>
       </w:r>
     </w:p>
     <w:p>

</xml_diff>

<commit_message>
Deepen Chazal paper to ~2,370 words per feedback
Add close-reading depth across all four questions: Q1 concrete leadership
application; Q2 the historical setting of the redaction and Halbertal on the
Mishnah's distinctive language and invented categories; Q3 Abba Sikara and the
biryonim, the theological weight of the Vespasian-vs-Titus difference, the
Peter Brown background to Lorberbaum, an analysis of the three requests, and a
'portable homeland' point; Q4 the prophet-to-sage sanctification of the scholar,
the two key symbolic details, and the Bavli/Yerushalmi split in Boyarin. Stays
under the 2,500-word limit; no source repeated across questions.

Co-Authored-By: Claude Opus 4.8 <noreply@anthropic.com>
Claude-Session: https://claude.ai/code/session_01VbbPAGC8dgxj7crtn1UqbW
</commit_message>
<xml_diff>
--- a/עבודת_סיום_חזל.docx
+++ b/עבודת_סיום_חזל.docx
@@ -262,6 +262,23 @@
     <w:p>
       <w:pPr>
         <w:bidi w:val="1"/>
+        <w:spacing w:line="360" w:lineRule="auto" w:after="160"/>
+        <w:jc w:val="both"/>
+      </w:pPr>
+      <w:r>
+        <w:rPr>
+          <w:rFonts w:ascii="David" w:hAnsi="David" w:cs="David"/>
+          <w:b w:val="0"/>
+          <w:sz w:val="24"/>
+          <w:szCs w:val="24"/>
+          <w:rtl w:val="1"/>
+        </w:rPr>
+        <w:t>בקבוצה שאני מובילה זה מתורגם לשאלות יומיומיות. מי לא הגיע היום ולא טרחנו לברר למה. מי נשאר בשוליים של השיחה בלי שאיש פנה אליו. מי יצא בסוף המפגש לבד. המשנה מזכירה לי שהימנעות מפעולה היא בעצמה מעשה, ושהאדישות של מנהיג נזקפת לחובתו כמעט כמו מעשה של ממש. זה מסר לא נוח, ודווקא משום כך הוא כזה שכדאי לומר בקול.</w:t>
+      </w:r>
+    </w:p>
+    <w:p>
+      <w:pPr>
+        <w:bidi w:val="1"/>
         <w:spacing w:line="360" w:lineRule="auto" w:before="200" w:after="80"/>
         <w:jc w:val="right"/>
       </w:pPr>
@@ -324,6 +341,23 @@
           <w:szCs w:val="24"/>
           <w:rtl w:val="1"/>
         </w:rPr>
+        <w:t>העריכה הזאת לא נעשתה בחלל ריק. היא באה אחרי דור שראה את חורבן הבית ואת דיכוי מרד בר כוכבא, תקופה של אבדן מרכזים, של הרוגים ושל סכנה ממשית שהמסורת שנמסרה עד אז בעל פה תישכח. רבי אסף, ערך וקבע נוסח, וכך הפך זרם של דברים שנשמעו בבתי המדרש לחיבור אחד שאפשר ללמד, ללמוד ולמסור הלאה. עצם ההחלטה לקבע את התורה שבעל פה במסגרת ברורה היא כבר מעשה של הצלה.</w:t>
+      </w:r>
+    </w:p>
+    <w:p>
+      <w:pPr>
+        <w:bidi w:val="1"/>
+        <w:spacing w:line="360" w:lineRule="auto" w:after="160"/>
+        <w:jc w:val="both"/>
+      </w:pPr>
+      <w:r>
+        <w:rPr>
+          <w:rFonts w:ascii="David" w:hAnsi="David" w:cs="David"/>
+          <w:b w:val="0"/>
+          <w:sz w:val="24"/>
+          <w:szCs w:val="24"/>
+          <w:rtl w:val="1"/>
+        </w:rPr>
         <w:t>ב. משמעותה והשינוי שחוללה. הלברטל, במבוא למשנה, קובע שהמשנה היא "תוצר של עלייתו של אידיאל טיפוס חדש: התלמיד חכם, והולדתה במוסד חדש: בית המדרש". לדבריו, דווקא משום שהחכמים אינם מדברים בשם ההתגלות, כפי שדיברו הנביאים, המחלוקת ביניהם לגיטימית, וזו הסיבה שהמשנה יכולה לשמר דעות חלוקות זו לצד זו בתוך הטקסט המחייב. זו התנועה שהקורס כינה "מנביא לחכם": מרכז הכובד של הדת עובר מן הנבואה ומן המקדש אל בית המדרש ואל ציבור החכמים. המשנה מכוננת בכך את התורה שבעל פה כמערכת בפני עצמה, ומשנה את פני היהדות. השפעתה עצומה, שני התלמודים נבנו עליה כפירוש, וכל ההלכה שאחריה יונקת ממנה.</w:t>
       </w:r>
     </w:p>
@@ -364,6 +398,23 @@
     <w:p>
       <w:pPr>
         <w:bidi w:val="1"/>
+        <w:spacing w:line="360" w:lineRule="auto" w:after="160"/>
+        <w:jc w:val="both"/>
+      </w:pPr>
+      <w:r>
+        <w:rPr>
+          <w:rFonts w:ascii="David" w:hAnsi="David" w:cs="David"/>
+          <w:b w:val="0"/>
+          <w:sz w:val="24"/>
+          <w:szCs w:val="24"/>
+          <w:rtl w:val="1"/>
+        </w:rPr>
+        <w:t>מאפיין נוסף שהלברטל עומד עליו הוא הלשון. חכמי המשנה הקפידו להבחין את לשונם מלשון המקרא, וניסחו את ההלכה בעברית קצרה, חדה ונוקבת, בלי סלסולים. יותר מזה, הם טבעו מושגים וקטגוריות חדשים לגמרי, כמו "מפני תיקון העולם", "מפני דרכי שלום", "בין אדם לחברו" ו"בין אדם למקום". אלה אינם רק כותרות, הם כלים של מחשבה שבאמצעותם ארגנה המשנה את המציאות מחדש. השפה עצמה היא חלק מהחידוש. חדש לא רק מה שנאמר, גם הדרך שבה הוא מנוסח.</w:t>
+      </w:r>
+    </w:p>
+    <w:p>
+      <w:pPr>
+        <w:bidi w:val="1"/>
         <w:spacing w:line="360" w:lineRule="auto" w:before="200" w:after="80"/>
         <w:jc w:val="right"/>
       </w:pPr>
@@ -392,7 +443,7 @@
           <w:szCs w:val="24"/>
           <w:rtl w:val="1"/>
         </w:rPr>
-        <w:t>א. המדרש. הקטע מבוסס על סיפור יציאת רבן יוחנן בן זכאי מירושלים הנצורה ובקשת יבנה, בבבלי, מסכת גיטין נו ע"א-ע"ב. בלב המדרש עומדת התחבולה והמפגש עם הקיסר. ריב"ז מעמיד פני מת, תלמידיו מוציאים את ארונו מן העיר שהבריונים אוסרים לצאת ממנה, ובמחנה הרומי הוא פונה אל אספסיאנוס: "שלום עליך המלך". אספסיאנוס משיב שהוא חייב מיתה, שהרי קרא לו מלך והוא אינו מלך. באותו רגע מגיע שליח מרומא ומבשר שאספסיאנוס נתמנה לקיסר, והברכה מתאמתת. אז מבקש ריב"ז את בקשתו: "תן לי יבנה וחכמיה" (בבלי, גיטין נו ע"ב).</w:t>
+        <w:t>א. המדרש. הקטע מבוסס על סיפור יציאת רבן יוחנן בן זכאי מירושלים הנצורה ובקשת יבנה, בבבלי, מסכת גיטין נו ע"א-ע"ב. בלב המדרש עומדת התחבולה והמפגש עם הקיסר. התחבולה נרקמת בעצת אבא סיקרא, ראש הבריונים ובן אחותו של ריב"ז. הבריונים, שהחזיקו בעיר ביד קשה ואף שרפו את מחסני המזון כדי לאלץ את התושבים להילחם, אינם מתירים לאיש לצאת מן העיר החוצה אלא למתים בלבד. אבא סיקרא מייעץ לרבו להעמיד פני חולה ואחר כך פני מת, כדי שתלמידיו יוכלו להוציא את ארונו. ריב"ז עושה כן, וכשהוא מגיע אל מחנהו של אספסיאנוס הוא פונה אליו: "שלום עליך המלך". אספסיאנוס משיב שהוא חייב מיתה, שהרי קרא לו מלך והוא אינו מלך, ואם הוא מלך, מדוע לא בא עד עתה. באותו רגע ממש מגיע שליח מרומא ומבשר שאספסיאנוס נתמנה לקיסר, והברכה מתאמתת מאליה. אז מבקש ריב"ז את בקשתו: "תן לי יבנה וחכמיה" (בבלי, גיטין נו ע"ב).</w:t>
       </w:r>
     </w:p>
     <w:p>
@@ -426,6 +477,23 @@
           <w:szCs w:val="24"/>
           <w:rtl w:val="1"/>
         </w:rPr>
+        <w:t>ההבדל בין אספסיאנוס לטיטוס אינו רק שינוי שם. במדרש הנבואה מתגשמת על המקום, והשליח מרומא מאשר את דברי ריב"ז מיד, כך שהחכם מצטייר כמי שרואה את הנולד ואלוהי ישראל פועל דרך ההיסטוריה. בסרט הנבואה נשארת פתוחה והכרעתה מושהית, וטיטוס המתגרה מבקש "להראות את כוח אלי רומא". כך הסרט מחזיר אל הסיפור את המתח ואת הספק, במקום הוודאות הדתית של המדרש, ובכך הוא נאמן פחות לאגדה אבל קרוב יותר לתחושת אדם מודרני שאינו יודע כיצד ייגמר.</w:t>
+      </w:r>
+    </w:p>
+    <w:p>
+      <w:pPr>
+        <w:bidi w:val="1"/>
+        <w:spacing w:line="360" w:lineRule="auto" w:after="160"/>
+        <w:jc w:val="both"/>
+      </w:pPr>
+      <w:r>
+        <w:rPr>
+          <w:rFonts w:ascii="David" w:hAnsi="David" w:cs="David"/>
+          <w:b w:val="0"/>
+          <w:sz w:val="24"/>
+          <w:szCs w:val="24"/>
+          <w:rtl w:val="1"/>
+        </w:rPr>
         <w:t>רגע המעבר עצמו טעון בסמליות. ריב"ז יוצא מן העיר בתוך ארון, כמת, וזה בדיוק מה שמאפשר לו לחיות ולהמשיך. העיר הנצורה, שהקנאים אוסרים לצאת ממנה, מתפקדת כקבר, ומי שמוותר לכאורה על החיים הוא זה שמציל אותם. אפשר לקרוא את זה כתמונה של החורבן כולו: מה שנראה כמוות, הוא ראשיתה של לידה מחדש.</w:t>
       </w:r>
     </w:p>
@@ -443,7 +511,7 @@
           <w:szCs w:val="24"/>
           <w:rtl w:val="1"/>
         </w:rPr>
-        <w:t>ג. בעזרת המאמר. לורברבוים, במאמרו "ממקדש לאדם: תמורות במוקד הקדושה בספרות חז"ל", מראה שאחרי החורבן מעתיקה ספרות חז"ל, ובעיקר השכבה התנאית, את מוקד הקדושה מן המקדש אל האדם. הוא מדגיש שההעתקה הזאת אינה אל אישיות קדושה ויוצאת דופן, אלא אל האדם, אל כל אדם, מכוח הרעיון שהאדם נברא בצלם אלוהים. בקשתו של ריב"ז מגלמת את ראשית התנועה הזאת. הוא אינו מבקש להציל את המקדש אלא את יבנה וחכמיה, ובכך בוחר בהמשכיות התורה ובבני האדם הלומדים אותה על פני המרכז הפיזי. מרקס, בניתוח סיפור ריב"ז והקמת יבנה, מוסיפה שהיציאה בארון היא הצגה סמלית של עצם השינוי: היהדות שהיתה דת של גוף, של ארץ ושל פולחן במקדש נולדת מחדש כ"עם הספר", ולדבריה האגדה אינה מתארת את המעבר בלבד אלא יוצרת אותו ומעניקה לו משמעות. על רקע זה מובנת גם הביקורת המרומזת על ריב"ז. הדרשן רומז שאולי היה יכול לבקש יותר, ואף מפעיל על החכם את הפסוק "משיב חכמים אחור" (ישעיהו מד, כה), כלומר גם חכמתו של הגדול הוגבלה ברגע הגורלי. השתיקה והספק אינם פגם בסיפור, הם חלק ממנו, והאגדה מתלבטת בשאלה מה מותר ואפשר להציל כשהכול קורס.</w:t>
+        <w:t>ג. בעזרת המאמר. לורברבוים, במאמרו "ממקדש לאדם: תמורות במוקד הקדושה בספרות חז"ל", פותח ברקע היסטורי רחב. חוקרים של המאות הראשונות לספירה הראו שהמוקד הדתי בתקופה הזאת עבר בהדרגה ממקומות קדושים אל בני אדם קדושים, וכי הפיחות בקדושת המקום לא נבע רק מחורבן מקדשים אלא משינוי עמוק בתודעה הדתית. על הרקע הזה מראה לורברבוים שספרות חז"ל, ובעיקר השכבה התנאית, מעתיקה את מוקד הקדושה מן המקדש אל האדם. הוא מדגיש נקודה ייחודית: ההעתקה הרבנית אינה אל אישיות קדושה ויוצאת דופן, אלא אל האדם, אל כל אדם, מכוח הרעיון שהאדם נברא בצלם אלוהים. בקשתו של ריב"ז מגלמת את ראשית התנועה הזאת. הוא אינו מבקש להציל את המקדש אלא את יבנה וחכמיה, ובכך בוחר בהמשכיות התורה ובבני האדם הלומדים אותה על פני המרכז הפיזי. מרקס, בניתוח סיפור ריב"ז והקמת יבנה, מוסיפה שהיציאה בארון היא הצגה סמלית של עצם השינוי: היהדות שהיתה דת של גוף, של ארץ ושל פולחן במקדש נולדת מחדש כ"עם הספר", ולדבריה האגדה אינה מתארת את המעבר בלבד אלא יוצרת אותו ומעניקה לו משמעות. על רקע זה מובנת גם הביקורת המרומזת על ריב"ז. הדרשן רומז שאולי היה יכול לבקש יותר, ואף מפעיל על החכם את הפסוק "משיב חכמים אחור" (ישעיהו מד, כה), כלומר גם חכמתו של הגדול הוגבלה ברגע הגורלי. השתיקה והספק אינם פגם בסיפור, הם חלק ממנו, והאגדה מתלבטת בשאלה מה מותר ואפשר להציל כשהכול קורס.</w:t>
       </w:r>
     </w:p>
     <w:p>
@@ -460,7 +528,24 @@
           <w:szCs w:val="24"/>
           <w:rtl w:val="1"/>
         </w:rPr>
-        <w:t>ד. משמעותו לימינו. לדעתי זהו המדרש הנלמד ביותר על החורבן משום שהוא סיפור המכונן של ההישרדות היהודית. הוא מספר איך דת שנשענה על מקדש וקורבנות הפכה לדת של לימוד וטקסט, ניידת, שיכולה לשרוד בכל מקום. "תן לי יבנה וחכמיה" הוא הרגע שבו נבחרת ההמשכיות הרוחנית על פני הריבונות והאבן. לכן הוא נשאר רלוונטי. הוא המודל של בנייה מחדש אחרי אסון, ושל הבחירה בחיים ובלימוד גם כשהמרכז נחרב.</w:t>
+        <w:t>שווה לעצור רגע על שלוש הבקשות עצמן, כי דווקא בהן מסתתר החזון. ריב"ז אינו מבקש נשק, לא כסף ולא שלטון. הוא מבקש את יבנה וחכמיה, כלומר מקום ללמוד בו, את שושלת רבן גמליאל, כלומר המשכיות של הנהגה מוכרת, ורופאים לרבי צדוק, החכם שהתענה שנים על סף החורבן, כלומר את חייו של אדם אחד. בשלוש הבקשות האלה יש כמעט כל מה שצריך כדי להתחיל מחדש: מקום לימוד, הנהגה, ואדם חי. מי שקורא את זה היום יכול לשאול את עצמו מה הוא היה מבקש ברגע כזה, וכמה קל להתפתות לבקש דווקא את מה שנחרב במקום את מה שיאפשר לבנות מחדש.</w:t>
+      </w:r>
+    </w:p>
+    <w:p>
+      <w:pPr>
+        <w:bidi w:val="1"/>
+        <w:spacing w:line="360" w:lineRule="auto" w:after="160"/>
+        <w:jc w:val="both"/>
+      </w:pPr>
+      <w:r>
+        <w:rPr>
+          <w:rFonts w:ascii="David" w:hAnsi="David" w:cs="David"/>
+          <w:b w:val="0"/>
+          <w:sz w:val="24"/>
+          <w:szCs w:val="24"/>
+          <w:rtl w:val="1"/>
+        </w:rPr>
+        <w:t>ד. משמעותו לימינו. לדעתי זהו המדרש הנלמד ביותר על החורבן משום שהוא סיפור המכונן של ההישרדות היהודית. הוא מספר איך דת שנשענה על מקדש וקורבנות הפכה לדת של לימוד וטקסט, ניידת, שיכולה לשרוד בכל מקום. "תן לי יבנה וחכמיה" הוא הרגע שבו נבחרת ההמשכיות הרוחנית על פני הריבונות והאבן. לכן הוא נשאר רלוונטי. הוא המודל של בנייה מחדש אחרי אסון, ושל הבחירה בחיים ובלימוד גם כשהמרכז נחרב. אפשר לומר שהסיפור נתן לעם היהודי מולדת ניידת: כל עוד יש חכמים ובית מדרש, אפשר להתחיל מחדש בכל מקום. זו הסיבה שהמדרש הזה חזר ולּמד בכל דור שבו איים על העם משבר או גלות, ולא נשאר סיפור על עבר רחוק אלא נעשה מפתח להווה.</w:t>
       </w:r>
     </w:p>
     <w:p>
@@ -528,7 +613,24 @@
           <w:szCs w:val="24"/>
           <w:rtl w:val="1"/>
         </w:rPr>
-        <w:t>ב. מגמות ומאפיינים של תקופת חז"ל. המדרש מציב את לימוד התורה כערך עליון שגובר על ייחוס ועל עושר. אליעזר אינו בן כוהנים ולא עילוי מנעוריו, הוא בן איכר שמתחיל מאוחר ובאדמת טרשים, ובכל זאת התורה פתוחה בפניו. זו אחת התנועות המרכזיות של התקופה, פתיחת התורה לכל אדם והפיכת בית המדרש למרכז שמחליף את סדרי הייחוס הישנים. לצד זה בולט אופי הלימוד. ריב"ז מלמד את אליעזר יום יום, מהיסוד ופנים אל פנים, והידע עובר מפה לאוזן ולא מן הכתב, כדרכה של תורה שבעל פה. ויש כאן עוד רובד, התפיסה שהלימוד עצמו מקדש את האדם, עד שפניו מאירות כפני משה. זהו ביטוי מובהק למעבר "מנביא לחכם", שבו מקום הנבואה נתפס עכשיו בידי החכם שדורש בבית המדרש.</w:t>
+        <w:t>שני פרטים בסיפור נראים לי מפתח. הראשון הוא הבכי. אליעזר אינו מורד ואינו בורח בזעם, הוא יושב ובוכה, והבכי הזה הוא שמניע את כל העלילה, שכן הוא מסמן געגוע עמוק וכן ולא גחמה חולפת. השני הוא אדמת הטרשים. אליעזר חורש דווקא בקרקע הקשה, ומן המקום הכי פחות פורה צומחת דמות שתשנה את עולם התורה. הניגוד בין הטרשים לבין הפנים המאירות כאור החמה הוא לב הסיפור, והוא מוסר בדימוי אחד את כל מה שהמדרש רוצה לומר על כוחו של הרצון ללמוד.</w:t>
+      </w:r>
+    </w:p>
+    <w:p>
+      <w:pPr>
+        <w:bidi w:val="1"/>
+        <w:spacing w:line="360" w:lineRule="auto" w:after="160"/>
+        <w:jc w:val="both"/>
+      </w:pPr>
+      <w:r>
+        <w:rPr>
+          <w:rFonts w:ascii="David" w:hAnsi="David" w:cs="David"/>
+          <w:b w:val="0"/>
+          <w:sz w:val="24"/>
+          <w:szCs w:val="24"/>
+          <w:rtl w:val="1"/>
+        </w:rPr>
+        <w:t>ב. מגמות ומאפיינים של תקופת חז"ל. המדרש מציב את לימוד התורה כערך עליון שגובר על ייחוס ועל עושר. אליעזר אינו בן כוהנים ולא עילוי מנעוריו, הוא בן איכר שמתחיל מאוחר ובאדמת טרשים, ובכל זאת התורה פתוחה בפניו. זו אחת התנועות המרכזיות של התקופה, פתיחת התורה לכל אדם והפיכת בית המדרש למרכז שמחליף את סדרי הייחוס הישנים. לצד זה בולט אופי הלימוד. ריב"ז מלמד את אליעזר יום יום, מהיסוד ופנים אל פנים, והידע עובר מפה לאוזן ולא מן הכתב, כדרכה של תורה שבעל פה. ויש כאן עוד רובד, התפיסה שהלימוד עצמו מקדש את האדם, עד שפניו מאירות כפני משה. זהו ביטוי מובהק למעבר "מנביא לחכם", שבו מקום הנבואה נתפס עכשיו בידי החכם שדורש בבית המדרש. כשפניו של אליעזר מאירות כפני משה, החכם נעשה כמעט יורשו של הנביא. הזוהר שהיה פעם סימן להתגלות ישירה עובר אל מי שדורש תורה, ותלמיד שהתחיל מאדמת טרשים לובש הילה שהיתה שמורה למשה רבנו. הלימוד אינו רק רכישת ידע, הוא הופך את האדם עצמו למקום שבו התורה מאירה.</w:t>
       </w:r>
     </w:p>
     <w:p>
@@ -562,7 +664,7 @@
           <w:szCs w:val="24"/>
           <w:rtl w:val="1"/>
         </w:rPr>
-        <w:t>ג. הרחבה על דמות ר' אליעזר ממקורות נוספים. הדמות הזאת מורכבת יותר משנדמה במבט ראשון. אותו ר' אליעזר, שהגיע אל התורה מבחוץ ומאוחר וכנגד כל הציפיות, הוא גם זה שאומר במשנה על לימוד תורה לנשים: "כל המלמד את בתו תורה כאילו מלמדה תפלות" (משנה, סוטה ג, ד). ההקשר שם חריף במיוחד, שכן דבריו נאמרים כנגד עמדתו של בן עזאי באותה משנה: "חייב אדם ללמד את בתו תורה". מי שנאבק בעצמו על הכניסה אל עולם התורה מציב דווקא גבול חד בפני מי שמבקש להיכנס אליו מכיוון אחר. בויארין, בפרק "תאוות הלימוד: התורה כאישה אחרת", קורא את המחלוקת הזאת כמחלוקת עקרונית ולא כפרט שולי. הוא מראה שהבבלי והירושלמי מפרשים את המשנה בכיוונים שונים לגמרי, ושהעמדה השוללת לימוד תורה מנשים קשורה בבנייתו של בית המדרש כמרחב גברי, שבו תלמוד תורה הוא המעשה שזוכה להערכה הגבוהה ביותר. הצירוף בין שני המקורות מצייר את ר' אליעזר כדמות של אדם שהתורה הצילה והגדירה, ושבה בעצמו לשמור בקנאות על מי נכנס בשעריה. דווקא המורכבות הזאת הופכת אותו לדמות מייצגת של התקופה, שבה נקבעים גם השערים הפתוחים, לבן איכר שמתחיל מאפס, וגם הגבולות הנעולים, בפני מי שנשאר מבחוץ.</w:t>
+        <w:t>ג. הרחבה על דמות ר' אליעזר ממקורות נוספים. הדמות הזאת מורכבת יותר משנדמה במבט ראשון. אותו ר' אליעזר, שהגיע אל התורה מבחוץ ומאוחר וכנגד כל הציפיות, הוא גם זה שאומר במשנה על לימוד תורה לנשים: "כל המלמד את בתו תורה כאילו מלמדה תפלות" (משנה, סוטה ג, ד). ההקשר שם חריף במיוחד, שכן דבריו נאמרים כנגד עמדתו של בן עזאי באותה משנה: "חייב אדם ללמד את בתו תורה". מי שנאבק בעצמו על הכניסה אל עולם התורה מציב דווקא גבול חד בפני מי שמבקש להיכנס אליו מכיוון אחר. בויארין, בפרק "תאוות הלימוד: התורה כאישה אחרת", קורא את המחלוקת הזאת כמחלוקת עקרונית ולא כפרט שולי. הוא מראה שהבבלי והירושלמי מפרשים את המשנה בכיוונים שונים לגמרי. לפי הירושלמי, הזכות שמגינה על האישה החשודה כסוטה היא זכות תלמוד תורה, ומכאן שאב המבקש להגן על בתו צריך ללמדה תורה. הבבלי, לעומתו, אינו מפרש כך את בן עזאי, ומצמצם את המשמעות הרדיקלית של דבריו. ההבדל הזה, טוען בויארין, אינו טכני. הוא נוגע לשאלה עד כמה מוכן העולם הרבני לפתוח את שערי בית המדרש בפני נשים, שכן העמדה השוללת לימוד תורה מהן קשורה בבנייתו של בית המדרש כמרחב גברי, שבו תלמוד תורה הוא המעשה שזוכה להערכה הגבוהה ביותר. הצירוף בין שני המקורות מצייר את ר' אליעזר כדמות של אדם שהתורה הצילה והגדירה, ושבה בעצמו לשמור בקנאות על מי נכנס בשעריה. דווקא המורכבות הזאת הופכת אותו לדמות מייצגת של התקופה, שבה נקבעים גם השערים הפתוחים, לבן איכר שמתחיל מאפס, וגם הגבולות הנעולים, בפני מי שנשאר מבחוץ.</w:t>
       </w:r>
     </w:p>
     <w:p>

</xml_diff>

<commit_message>
Title page: add submitter Hassan Masalha + ID; convert body to masculine
Fill the Chazal paper title page with the student's name and ID, and switch the
first-person self-references from feminine to masculine ('she-ani movila' ->
'movil', 'hayiti mevi'a' -> 'mevi') to match the submitter.

Co-Authored-By: Claude Opus 4.8 <noreply@anthropic.com>
Claude-Session: https://claude.ai/code/session_01VbbPAGC8dgxj7crtn1UqbW
</commit_message>
<xml_diff>
--- a/עבודת_סיום_חזל.docx
+++ b/עבודת_סיום_חזל.docx
@@ -149,7 +149,24 @@
           <w:szCs w:val="24"/>
           <w:rtl w:val="1"/>
         </w:rPr>
-        <w:t>מגישה: [שם מלא + ת"ז]</w:t>
+        <w:t>מגיש: חסאן מסאלחה</w:t>
+      </w:r>
+    </w:p>
+    <w:p>
+      <w:pPr>
+        <w:bidi w:val="1"/>
+        <w:spacing w:line="360" w:lineRule="auto" w:after="40"/>
+        <w:jc w:val="center"/>
+      </w:pPr>
+      <w:r>
+        <w:rPr>
+          <w:rFonts w:ascii="David" w:hAnsi="David" w:cs="David"/>
+          <w:b w:val="0"/>
+          <w:sz w:val="24"/>
+          <w:szCs w:val="24"/>
+          <w:rtl w:val="1"/>
+        </w:rPr>
+        <w:t>ת.ז: 205513898</w:t>
       </w:r>
     </w:p>
     <w:p>
@@ -205,7 +222,7 @@
           <w:szCs w:val="24"/>
           <w:rtl w:val="1"/>
         </w:rPr>
-        <w:t>בחרתי בפרשת עגלה ערופה, ובקריאה שחז"ל קוראים בה, כי יש בה בדיוק המסר שהייתי רוצה לחדד בפני קבוצה שאני מובילה. מנהיג אחראי גם על מי שנשמט מתשומת ליבו, ולא רק על מה שעשה במו ידיו.</w:t>
+        <w:t>בחרתי בפרשת עגלה ערופה, ובקריאה שחז"ל קוראים בה, כי יש בה בדיוק המסר שהייתי רוצה לחדד בפני קבוצה שאני מוביל. מנהיג אחראי גם על מי שנשמט מתשומת ליבו, ולא רק על מה שעשה במו ידיו.</w:t>
       </w:r>
     </w:p>
     <w:p>
@@ -256,7 +273,7 @@
           <w:szCs w:val="24"/>
           <w:rtl w:val="1"/>
         </w:rPr>
-        <w:t>ג. מדוע הוא רלוונטי. כאן טמון הכוח של הטקסט למי שמוביל קבוצה. חז"ל הופכים הצהרת חפות להצהרת אחריות. הם קוראים לתוך הפסוק שאלה על מנהיגות: לא רק "האם הרמתי יד", אלא "האם שמתי לב שמישהו יוצא לדרך לבד, בלי מזון ובלי מלווה". התלמוד מרחיב את זה עד הקצה: "כל שאינו מלוה ומתלוה כאילו שופך דמים" (בבלי, סוטה מו ע"ב). את המסר הזה הייתי מביאה לקבוצה שאני מובילה. הקלות שבה אנחנו פוטרים את עצמנו, "אני לא עשיתי כלום", היא בדיוק מה שהמשנה באה לפרק. המבחן האמיתי של מנהיג הוא דווקא מי שיצא מהחדר בלי שליווה אותו, לא מי שנשאר בפנים. ויש כאן גם דוגמה יפה לתנועה שהקורס עסק בה, מהמקרא אל המשנה ואל התלמוד. ההלכה המקראית נשארת במקומה, והמשמעות המוסרית שנקראת לתוכה רק הולכת ומעמיקה.</w:t>
+        <w:t>ג. מדוע הוא רלוונטי. כאן טמון הכוח של הטקסט למי שמוביל קבוצה. חז"ל הופכים הצהרת חפות להצהרת אחריות. הם קוראים לתוך הפסוק שאלה על מנהיגות: לא רק "האם הרמתי יד", אלא "האם שמתי לב שמישהו יוצא לדרך לבד, בלי מזון ובלי מלווה". התלמוד מרחיב את זה עד הקצה: "כל שאינו מלוה ומתלוה כאילו שופך דמים" (בבלי, סוטה מו ע"ב). את המסר הזה הייתי מביא לקבוצה שאני מוביל. הקלות שבה אנחנו פוטרים את עצמנו, "אני לא עשיתי כלום", היא בדיוק מה שהמשנה באה לפרק. המבחן האמיתי של מנהיג הוא דווקא מי שיצא מהחדר בלי שליווה אותו, לא מי שנשאר בפנים. ויש כאן גם דוגמה יפה לתנועה שהקורס עסק בה, מהמקרא אל המשנה ואל התלמוד. ההלכה המקראית נשארת במקומה, והמשמעות המוסרית שנקראת לתוכה רק הולכת ומעמיקה.</w:t>
       </w:r>
     </w:p>
     <w:p>
@@ -273,7 +290,7 @@
           <w:szCs w:val="24"/>
           <w:rtl w:val="1"/>
         </w:rPr>
-        <w:t>בקבוצה שאני מובילה זה מתורגם לשאלות יומיומיות. מי לא הגיע היום ולא טרחנו לברר למה. מי נשאר בשוליים של השיחה בלי שאיש פנה אליו. מי יצא בסוף המפגש לבד. המשנה מזכירה לי שהימנעות מפעולה היא בעצמה מעשה, ושהאדישות של מנהיג נזקפת לחובתו כמעט כמו מעשה של ממש. זה מסר לא נוח, ודווקא משום כך הוא כזה שכדאי לומר בקול.</w:t>
+        <w:t>בקבוצה שאני מוביל זה מתורגם לשאלות יומיומיות. מי לא הגיע היום ולא טרחנו לברר למה. מי נשאר בשוליים של השיחה בלי שאיש פנה אליו. מי יצא בסוף המפגש לבד. המשנה מזכירה לי שהימנעות מפעולה היא בעצמה מעשה, ושהאדישות של מנהיג נזקפת לחובתו כמעט כמו מעשה של ממש. זה מסר לא נוח, ודווקא משום כך הוא כזה שכדאי לומר בקול.</w:t>
       </w:r>
     </w:p>
     <w:p>

</xml_diff>

<commit_message>
Complete the Marx citation (Moed 21, 56-85) found via web search
The full source was missing from the syllabus (truncated) and the article
excerpt; a web search located it in the journal Moed, vol. 21 (5774), pp. 56-85,
corroborated by the page numbers in the article PDF. Replaces the placeholder.

Co-Authored-By: Claude Opus 4.8 <noreply@anthropic.com>
Claude-Session: https://claude.ai/code/session_01VbbPAGC8dgxj7crtn1UqbW
</commit_message>
<xml_diff>
--- a/עבודת_סיום_חזל.docx
+++ b/עבודת_סיום_חזל.docx
@@ -835,7 +835,7 @@
           <w:szCs w:val="24"/>
           <w:rtl w:val="1"/>
         </w:rPr>
-        <w:t xml:space="preserve">מרקס, ד'. רבן יוחנן בן זכאי והקמת יבנה: ניתוח והערכת הסיפור בראי הזמן. </w:t>
+        <w:t xml:space="preserve">מרקס, ד' (תשע"ד). רבן יוחנן בן זכאי והקמת יבנה: ניתוח והערכת הסיפור בראי הזמן. </w:t>
       </w:r>
       <w:r>
         <w:rPr>
@@ -845,6 +845,7 @@
           <w:szCs w:val="24"/>
           <w:rtl w:val="1"/>
         </w:rPr>
+        <w:t>מועד</w:t>
       </w:r>
       <w:r>
         <w:rPr>
@@ -854,7 +855,7 @@
           <w:szCs w:val="24"/>
           <w:rtl w:val="1"/>
         </w:rPr>
-        <w:t>[פרטי הפרסום להשלמה מהסילבוס].</w:t>
+        <w:t>, 21, 56-85.</w:t>
       </w:r>
     </w:p>
     <w:p>

</xml_diff>

<commit_message>
Add clickable link to the Marx article in the bibliography
Append a live hyperlink (maramrabbis.org) to the Marx reference entry.

Co-Authored-By: Claude Opus 4.8 <noreply@anthropic.com>
Claude-Session: https://claude.ai/code/session_01VbbPAGC8dgxj7crtn1UqbW
</commit_message>
<xml_diff>
--- a/עבודת_סיום_חזל.docx
+++ b/עבודת_סיום_חזל.docx
@@ -857,6 +857,27 @@
         </w:rPr>
         <w:t>, 21, 56-85.</w:t>
       </w:r>
+      <w:r>
+        <w:rPr>
+          <w:rFonts w:ascii="David" w:hAnsi="David" w:cs="David"/>
+          <w:b w:val="0"/>
+          <w:sz w:val="24"/>
+          <w:szCs w:val="24"/>
+          <w:rtl w:val="1"/>
+        </w:rPr>
+        <w:t xml:space="preserve"> זמין ב־</w:t>
+      </w:r>
+      <w:hyperlink r:id="rId9">
+        <w:r>
+          <w:rPr>
+            <w:rFonts w:ascii="David" w:hAnsi="David" w:cs="David"/>
+            <w:sz w:val="24"/>
+            <w:color w:val="0563C1"/>
+            <w:u w:val="single"/>
+          </w:rPr>
+          <w:t xml:space="preserve">www.maramrabbis.org</w:t>
+        </w:r>
+      </w:hyperlink>
     </w:p>
     <w:p>
       <w:pPr>

</xml_diff>

<commit_message>
Add Ono Academic College logo and name to the title page
Co-Authored-By: Claude Opus 4.8 <noreply@anthropic.com>
Claude-Session: https://claude.ai/code/session_01VbbPAGC8dgxj7crtn1UqbW
</commit_message>
<xml_diff>
--- a/עבודת_סיום_חזל.docx
+++ b/עבודת_סיום_חזל.docx
@@ -20,34 +20,59 @@
     </w:p>
     <w:p>
       <w:pPr>
+        <w:spacing w:after="280"/>
+        <w:jc w:val="center"/>
+      </w:pPr>
+      <w:r>
+        <w:drawing>
+          <wp:inline xmlns:a="http://schemas.openxmlformats.org/drawingml/2006/main" xmlns:pic="http://schemas.openxmlformats.org/drawingml/2006/picture">
+            <wp:extent cx="1554480" cy="1554480"/>
+            <wp:docPr id="1" name="Picture 1"/>
+            <wp:cNvGraphicFramePr>
+              <a:graphicFrameLocks noChangeAspect="1"/>
+            </wp:cNvGraphicFramePr>
+            <a:graphic>
+              <a:graphicData uri="http://schemas.openxmlformats.org/drawingml/2006/picture">
+                <pic:pic>
+                  <pic:nvPicPr>
+                    <pic:cNvPr id="0" name="a4cab871-IMG_3708.jpeg"/>
+                    <pic:cNvPicPr/>
+                  </pic:nvPicPr>
+                  <pic:blipFill>
+                    <a:blip r:embed="rId9"/>
+                    <a:stretch>
+                      <a:fillRect/>
+                    </a:stretch>
+                  </pic:blipFill>
+                  <pic:spPr>
+                    <a:xfrm>
+                      <a:off x="0" y="0"/>
+                      <a:ext cx="1554480" cy="1554480"/>
+                    </a:xfrm>
+                    <a:prstGeom prst="rect"/>
+                  </pic:spPr>
+                </pic:pic>
+              </a:graphicData>
+            </a:graphic>
+          </wp:inline>
+        </w:drawing>
+      </w:r>
+    </w:p>
+    <w:p>
+      <w:pPr>
         <w:bidi w:val="1"/>
-        <w:spacing w:line="360" w:lineRule="auto" w:after="0"/>
-        <w:jc w:val="both"/>
+        <w:spacing w:line="360" w:lineRule="auto" w:after="200"/>
+        <w:jc w:val="center"/>
       </w:pPr>
       <w:r>
         <w:rPr>
           <w:rFonts w:ascii="David" w:hAnsi="David" w:cs="David"/>
           <w:b w:val="0"/>
-          <w:sz w:val="24"/>
-          <w:szCs w:val="24"/>
+          <w:sz w:val="28"/>
+          <w:szCs w:val="28"/>
           <w:rtl w:val="1"/>
         </w:rPr>
-      </w:r>
-    </w:p>
-    <w:p>
-      <w:pPr>
-        <w:bidi w:val="1"/>
-        <w:spacing w:line="360" w:lineRule="auto" w:after="0"/>
-        <w:jc w:val="both"/>
-      </w:pPr>
-      <w:r>
-        <w:rPr>
-          <w:rFonts w:ascii="David" w:hAnsi="David" w:cs="David"/>
-          <w:b w:val="0"/>
-          <w:sz w:val="24"/>
-          <w:szCs w:val="24"/>
-          <w:rtl w:val="1"/>
-        </w:rPr>
+        <w:t>הקריה האקדמית אונו</w:t>
       </w:r>
     </w:p>
     <w:p>
@@ -867,7 +892,7 @@
         </w:rPr>
         <w:t xml:space="preserve"> זמין ב־</w:t>
       </w:r>
-      <w:hyperlink r:id="rId9">
+      <w:hyperlink r:id="rId10">
         <w:r>
           <w:rPr>
             <w:rFonts w:ascii="David" w:hAnsi="David" w:cs="David"/>

</xml_diff>